<commit_message>
fase 1 y fase 2 lista, con documentacion en informe
</commit_message>
<xml_diff>
--- a/INFORME/INFORME.docx
+++ b/INFORME/INFORME.docx
@@ -93,10 +93,7 @@
     </w:p>
     <w:p>
       <w:r>
-        <w:t>Crear modulo</w:t>
-      </w:r>
-      <w:r>
-        <w:t>.</w:t>
+        <w:t>Crear modulo.</w:t>
       </w:r>
     </w:p>
     <w:p>
@@ -118,14 +115,7 @@
           <w:b/>
           <w:bCs/>
         </w:rPr>
-        <w:t xml:space="preserve">1. La Función Lector </w:t>
-      </w:r>
-      <w:r>
-        <w:rPr>
-          <w:b/>
-          <w:bCs/>
-        </w:rPr>
-        <w:t xml:space="preserve">= </w:t>
+        <w:t xml:space="preserve">1. La Función Lector = </w:t>
       </w:r>
       <w:proofErr w:type="spellStart"/>
       <w:proofErr w:type="gramStart"/>
@@ -467,7 +457,1180 @@
         <w:t>.</w:t>
       </w:r>
     </w:p>
+    <w:p>
+      <w:pPr>
+        <w:rPr>
+          <w:b/>
+          <w:bCs/>
+        </w:rPr>
+      </w:pPr>
+    </w:p>
+    <w:p>
+      <w:pPr>
+        <w:rPr>
+          <w:b/>
+          <w:bCs/>
+        </w:rPr>
+      </w:pPr>
+      <w:r>
+        <w:rPr>
+          <w:b/>
+          <w:bCs/>
+        </w:rPr>
+        <w:t xml:space="preserve">2. </w:t>
+      </w:r>
+      <w:r>
+        <w:rPr>
+          <w:b/>
+          <w:bCs/>
+        </w:rPr>
+        <w:t xml:space="preserve">La Función </w:t>
+      </w:r>
+      <w:r>
+        <w:rPr>
+          <w:b/>
+          <w:bCs/>
+        </w:rPr>
+        <w:t>m</w:t>
+      </w:r>
+      <w:r>
+        <w:rPr>
+          <w:b/>
+          <w:bCs/>
+        </w:rPr>
+        <w:t xml:space="preserve">atemática </w:t>
+      </w:r>
+      <w:proofErr w:type="spellStart"/>
+      <w:proofErr w:type="gramStart"/>
+      <w:r>
+        <w:rPr>
+          <w:b/>
+          <w:bCs/>
+        </w:rPr>
+        <w:t>calcularUbicacion</w:t>
+      </w:r>
+      <w:proofErr w:type="spellEnd"/>
+      <w:r>
+        <w:rPr>
+          <w:b/>
+          <w:bCs/>
+        </w:rPr>
+        <w:t>(</w:t>
+      </w:r>
+      <w:proofErr w:type="gramEnd"/>
+      <w:r>
+        <w:rPr>
+          <w:b/>
+          <w:bCs/>
+        </w:rPr>
+        <w:t>)</w:t>
+      </w:r>
+      <w:r>
+        <w:rPr>
+          <w:b/>
+          <w:bCs/>
+        </w:rPr>
+        <w:t>:</w:t>
+      </w:r>
+    </w:p>
+    <w:p>
+      <w:r>
+        <w:t>Me</w:t>
+      </w:r>
+      <w:r>
+        <w:t xml:space="preserve"> </w:t>
+      </w:r>
+      <w:r>
+        <w:t>di</w:t>
+      </w:r>
+      <w:r>
+        <w:t xml:space="preserve"> cuenta de que </w:t>
+      </w:r>
+      <w:proofErr w:type="gramStart"/>
+      <w:r>
+        <w:t>leer</w:t>
+      </w:r>
+      <w:r>
+        <w:t>(</w:t>
+      </w:r>
+      <w:proofErr w:type="gramEnd"/>
+      <w:r>
+        <w:t>)</w:t>
+      </w:r>
+      <w:r>
+        <w:t xml:space="preserve"> </w:t>
+      </w:r>
+      <w:r>
+        <w:t>y</w:t>
+      </w:r>
+      <w:r>
+        <w:t xml:space="preserve"> </w:t>
+      </w:r>
+      <w:proofErr w:type="gramStart"/>
+      <w:r>
+        <w:t>escribir</w:t>
+      </w:r>
+      <w:r>
+        <w:t>(</w:t>
+      </w:r>
+      <w:proofErr w:type="gramEnd"/>
+      <w:r>
+        <w:t>)</w:t>
+      </w:r>
+      <w:r>
+        <w:t xml:space="preserve"> necesitaban la misma matemática para saber dónde pararse</w:t>
+      </w:r>
+      <w:r>
+        <w:t>, entonces p</w:t>
+      </w:r>
+      <w:r>
+        <w:t>ara no repetir código, creamos esta función de apoyo.</w:t>
+      </w:r>
+    </w:p>
+    <w:p>
+      <w:pPr>
+        <w:ind w:left="720"/>
+      </w:pPr>
+      <w:r>
+        <w:rPr>
+          <w:sz w:val="28"/>
+          <w:szCs w:val="28"/>
+        </w:rPr>
+        <w:t>Qué recibe:</w:t>
+      </w:r>
+      <w:r>
+        <w:t xml:space="preserve"> Las dimensiones del tablero columnas y la coordenada exacta que </w:t>
+      </w:r>
+      <w:r>
+        <w:t xml:space="preserve">se busca </w:t>
+      </w:r>
+      <w:r>
+        <w:t>fila, col. Además, recibe tres variables vacías con el símbolo &amp; paso por referencia.</w:t>
+      </w:r>
+    </w:p>
+    <w:p>
+      <w:pPr>
+        <w:ind w:left="720"/>
+      </w:pPr>
+      <w:r>
+        <w:rPr>
+          <w:sz w:val="28"/>
+          <w:szCs w:val="28"/>
+        </w:rPr>
+        <w:t>Qué retorna:</w:t>
+      </w:r>
+      <w:r>
+        <w:t xml:space="preserve"> </w:t>
+      </w:r>
+      <w:r>
+        <w:t>En realidad</w:t>
+      </w:r>
+      <w:r>
+        <w:t xml:space="preserve"> no retorna nada</w:t>
+      </w:r>
+      <w:r>
+        <w:t xml:space="preserve">: </w:t>
+      </w:r>
+      <w:proofErr w:type="spellStart"/>
+      <w:r>
+        <w:t>void</w:t>
+      </w:r>
+      <w:proofErr w:type="spellEnd"/>
+      <w:r>
+        <w:t>, pero gracias a las referencias</w:t>
+      </w:r>
+      <w:r>
+        <w:t>:</w:t>
+      </w:r>
+      <w:r>
+        <w:t xml:space="preserve"> &amp; abre un túnel directo a la memoria y modifica esas tres variables vacías desde adentro.</w:t>
+      </w:r>
+    </w:p>
+    <w:p>
+      <w:pPr>
+        <w:ind w:left="720"/>
+      </w:pPr>
+      <w:r>
+        <w:rPr>
+          <w:sz w:val="28"/>
+          <w:szCs w:val="28"/>
+        </w:rPr>
+        <w:t>Qué se busca:</w:t>
+      </w:r>
+      <w:r>
+        <w:t xml:space="preserve"> entrega en bandeja de plata los tres datos vitales: en qué </w:t>
+      </w:r>
+      <w:r>
+        <w:rPr>
+          <w:i/>
+          <w:iCs/>
+        </w:rPr>
+        <w:t>byte</w:t>
+      </w:r>
+      <w:r>
+        <w:t xml:space="preserve"> arranca la ficha, en qué </w:t>
+      </w:r>
+      <w:r>
+        <w:rPr>
+          <w:i/>
+          <w:iCs/>
+        </w:rPr>
+        <w:t>posición interna</w:t>
+      </w:r>
+      <w:r>
+        <w:t xml:space="preserve"> de ese byte arranca, y cuántos </w:t>
+      </w:r>
+      <w:r>
+        <w:rPr>
+          <w:i/>
+          <w:iCs/>
+        </w:rPr>
+        <w:t>bits disponibles</w:t>
+      </w:r>
+      <w:r>
+        <w:t xml:space="preserve"> quedan.</w:t>
+      </w:r>
+    </w:p>
+    <w:p>
+      <w:r>
+        <w:rPr>
+          <w:b/>
+          <w:bCs/>
+        </w:rPr>
+        <w:t xml:space="preserve">3. </w:t>
+      </w:r>
+      <w:r>
+        <w:rPr>
+          <w:b/>
+          <w:bCs/>
+        </w:rPr>
+        <w:t xml:space="preserve">La función constructora </w:t>
+      </w:r>
+      <w:proofErr w:type="spellStart"/>
+      <w:proofErr w:type="gramStart"/>
+      <w:r>
+        <w:rPr>
+          <w:b/>
+          <w:bCs/>
+        </w:rPr>
+        <w:t>escribirFicha</w:t>
+      </w:r>
+      <w:proofErr w:type="spellEnd"/>
+      <w:r>
+        <w:rPr>
+          <w:b/>
+          <w:bCs/>
+        </w:rPr>
+        <w:t>(</w:t>
+      </w:r>
+      <w:proofErr w:type="gramEnd"/>
+      <w:r>
+        <w:rPr>
+          <w:b/>
+          <w:bCs/>
+        </w:rPr>
+        <w:t>):</w:t>
+      </w:r>
+    </w:p>
+    <w:p>
+      <w:r>
+        <w:t>Es la única función autorizada para alterar el tablero.</w:t>
+      </w:r>
+    </w:p>
+    <w:p>
+      <w:r>
+        <w:tab/>
+      </w:r>
+      <w:r>
+        <w:rPr>
+          <w:sz w:val="28"/>
+          <w:szCs w:val="28"/>
+        </w:rPr>
+        <w:t>Qué recibe:</w:t>
+      </w:r>
+      <w:r>
+        <w:t xml:space="preserve"> El puntero al tablero, las coordenadas fila, col y el valor de la nueva ficha un número del 0 al 7.</w:t>
+      </w:r>
+      <w:r>
+        <w:t xml:space="preserve"> </w:t>
+      </w:r>
+      <w:r>
+        <w:t xml:space="preserve">Cuando creas la función para mostrar el tablero en consola, usas un switch o </w:t>
+      </w:r>
+      <w:proofErr w:type="spellStart"/>
+      <w:r>
+        <w:t>if</w:t>
+      </w:r>
+      <w:proofErr w:type="spellEnd"/>
+      <w:r>
+        <w:t xml:space="preserve"> que lee ese valor con </w:t>
+      </w:r>
+      <w:proofErr w:type="spellStart"/>
+      <w:r>
+        <w:t>leerFicha</w:t>
+      </w:r>
+      <w:proofErr w:type="spellEnd"/>
+      <w:r>
+        <w:t xml:space="preserve"> y decide qué carácter mostrar:</w:t>
+      </w:r>
+    </w:p>
+    <w:p>
+      <w:pPr>
+        <w:numPr>
+          <w:ilvl w:val="0"/>
+          <w:numId w:val="2"/>
+        </w:numPr>
+      </w:pPr>
+      <w:r>
+        <w:t xml:space="preserve">Si </w:t>
+      </w:r>
+      <w:proofErr w:type="spellStart"/>
+      <w:r>
+        <w:t>leerFicha</w:t>
+      </w:r>
+      <w:proofErr w:type="spellEnd"/>
+      <w:r>
+        <w:t>(...) te devuelve 0, imprim</w:t>
+      </w:r>
+      <w:r>
+        <w:t>o</w:t>
+      </w:r>
+      <w:r>
+        <w:t xml:space="preserve"> 'A' (o '#').</w:t>
+      </w:r>
+    </w:p>
+    <w:p>
+      <w:pPr>
+        <w:numPr>
+          <w:ilvl w:val="0"/>
+          <w:numId w:val="2"/>
+        </w:numPr>
+      </w:pPr>
+      <w:r>
+        <w:t>Si te devuelve 1, impri</w:t>
+      </w:r>
+      <w:r>
+        <w:t>mo</w:t>
+      </w:r>
+      <w:r>
+        <w:t xml:space="preserve"> 'B' (o '$').</w:t>
+      </w:r>
+    </w:p>
+    <w:p>
+      <w:pPr>
+        <w:numPr>
+          <w:ilvl w:val="0"/>
+          <w:numId w:val="2"/>
+        </w:numPr>
+      </w:pPr>
+      <w:r>
+        <w:t>Si te devuelve 6, imprimes un espacio en blanco ' '.</w:t>
+      </w:r>
+    </w:p>
+    <w:p>
+      <w:pPr>
+        <w:ind w:firstLine="708"/>
+      </w:pPr>
+      <w:r>
+        <w:rPr>
+          <w:sz w:val="28"/>
+          <w:szCs w:val="28"/>
+        </w:rPr>
+        <w:t>Qué retorna:</w:t>
+      </w:r>
+      <w:r>
+        <w:t xml:space="preserve"> Nada (</w:t>
+      </w:r>
+      <w:proofErr w:type="spellStart"/>
+      <w:r>
+        <w:t>void</w:t>
+      </w:r>
+      <w:proofErr w:type="spellEnd"/>
+      <w:r>
+        <w:t xml:space="preserve">). Hace su trabajo </w:t>
+      </w:r>
+      <w:r>
+        <w:t>en ejecución</w:t>
+      </w:r>
+      <w:r>
+        <w:t xml:space="preserve">, modifica memoria en la RAM, </w:t>
+      </w:r>
+      <w:proofErr w:type="spellStart"/>
+      <w:r>
+        <w:t>info</w:t>
+      </w:r>
+      <w:proofErr w:type="spellEnd"/>
+      <w:r>
+        <w:t xml:space="preserve"> que vive en el </w:t>
+      </w:r>
+      <w:proofErr w:type="spellStart"/>
+      <w:r>
+        <w:t>heap</w:t>
+      </w:r>
+      <w:proofErr w:type="spellEnd"/>
+      <w:r>
+        <w:t xml:space="preserve">, la función vive en el </w:t>
+      </w:r>
+      <w:proofErr w:type="spellStart"/>
+      <w:r>
+        <w:t>stack</w:t>
+      </w:r>
+      <w:proofErr w:type="spellEnd"/>
+      <w:r>
+        <w:t>(pila)</w:t>
+      </w:r>
+      <w:r>
+        <w:t>.</w:t>
+      </w:r>
+    </w:p>
+    <w:p>
+      <w:pPr>
+        <w:ind w:left="708"/>
+      </w:pPr>
+      <w:r>
+        <w:rPr>
+          <w:sz w:val="28"/>
+          <w:szCs w:val="28"/>
+        </w:rPr>
+        <w:lastRenderedPageBreak/>
+        <w:t>Qué se busca:</w:t>
+      </w:r>
+      <w:r>
+        <w:t xml:space="preserve"> llama a </w:t>
+      </w:r>
+      <w:proofErr w:type="spellStart"/>
+      <w:r>
+        <w:t>calcularUbicacion</w:t>
+      </w:r>
+      <w:proofErr w:type="spellEnd"/>
+      <w:r>
+        <w:t xml:space="preserve"> para saber dónde pararse. Luego, usa máscaras con operadores a nivel de bits ~ y &amp; para apagar</w:t>
+      </w:r>
+      <w:r>
+        <w:t xml:space="preserve"> </w:t>
+      </w:r>
+      <w:r>
+        <w:t xml:space="preserve">los 3 bits de esa coordenada, haciendo un hueco de ceros y </w:t>
+      </w:r>
+      <w:r>
+        <w:t>usando</w:t>
+      </w:r>
+      <w:r>
+        <w:t xml:space="preserve"> directamente la representación binaria en la memoria. Finalmente, inserta la ficha nueva con un |.</w:t>
+      </w:r>
+    </w:p>
+    <w:p>
+      <w:pPr>
+        <w:ind w:left="708"/>
+      </w:pPr>
+    </w:p>
+    <w:p>
+      <w:pPr>
+        <w:ind w:left="708"/>
+        <w:rPr>
+          <w:b/>
+          <w:bCs/>
+          <w:sz w:val="32"/>
+          <w:szCs w:val="32"/>
+        </w:rPr>
+      </w:pPr>
+      <w:r>
+        <w:rPr>
+          <w:b/>
+          <w:bCs/>
+          <w:sz w:val="32"/>
+          <w:szCs w:val="32"/>
+        </w:rPr>
+        <w:t xml:space="preserve">A este punto queda pendiente: </w:t>
+      </w:r>
+    </w:p>
+    <w:p>
+      <w:pPr>
+        <w:ind w:left="708"/>
+      </w:pPr>
+    </w:p>
+    <w:p>
+      <w:pPr>
+        <w:ind w:left="708"/>
+      </w:pPr>
+      <w:r>
+        <w:tab/>
+      </w:r>
+      <w:r>
+        <w:t>quedan pendientes 4 tareas clave:</w:t>
+      </w:r>
+    </w:p>
+    <w:p>
+      <w:pPr>
+        <w:ind w:left="720"/>
+      </w:pPr>
+      <w:r>
+        <w:rPr>
+          <w:b/>
+          <w:bCs/>
+        </w:rPr>
+        <w:t>Crear la Memoria Dinámica del Tablero:</w:t>
+      </w:r>
+      <w:r>
+        <w:t xml:space="preserve"> Calcular el tamaño exacto en bytes con la fórmula </w:t>
+      </w:r>
+      <m:oMath>
+        <m:r>
+          <m:rPr>
+            <m:nor/>
+          </m:rPr>
+          <m:t>bytes</m:t>
+        </m:r>
+        <m:r>
+          <w:rPr>
+            <w:rFonts w:ascii="Cambria Math" w:hAnsi="Cambria Math"/>
+          </w:rPr>
+          <m:t>=</m:t>
+        </m:r>
+        <m:f>
+          <m:fPr>
+            <m:ctrlPr>
+              <w:rPr>
+                <w:rFonts w:ascii="Cambria Math" w:hAnsi="Cambria Math"/>
+              </w:rPr>
+            </m:ctrlPr>
+          </m:fPr>
+          <m:num>
+            <m:d>
+              <m:dPr>
+                <m:ctrlPr>
+                  <w:rPr>
+                    <w:rFonts w:ascii="Cambria Math" w:hAnsi="Cambria Math"/>
+                  </w:rPr>
+                </m:ctrlPr>
+              </m:dPr>
+              <m:e>
+                <m:r>
+                  <m:rPr>
+                    <m:nor/>
+                  </m:rPr>
+                  <m:t>filas</m:t>
+                </m:r>
+                <m:r>
+                  <w:rPr>
+                    <w:rFonts w:ascii="Cambria Math" w:hAnsi="Cambria Math"/>
+                  </w:rPr>
+                  <m:t>×</m:t>
+                </m:r>
+                <m:r>
+                  <m:rPr>
+                    <m:nor/>
+                  </m:rPr>
+                  <m:t>columnas</m:t>
+                </m:r>
+                <m:r>
+                  <w:rPr>
+                    <w:rFonts w:ascii="Cambria Math" w:hAnsi="Cambria Math"/>
+                  </w:rPr>
+                  <m:t>×3</m:t>
+                </m:r>
+              </m:e>
+            </m:d>
+            <m:r>
+              <w:rPr>
+                <w:rFonts w:ascii="Cambria Math" w:hAnsi="Cambria Math"/>
+              </w:rPr>
+              <m:t>+7</m:t>
+            </m:r>
+          </m:num>
+          <m:den>
+            <m:r>
+              <w:rPr>
+                <w:rFonts w:ascii="Cambria Math" w:hAnsi="Cambria Math"/>
+              </w:rPr>
+              <m:t>8</m:t>
+            </m:r>
+          </m:den>
+        </m:f>
+      </m:oMath>
+      <w:r>
+        <w:t xml:space="preserve"> y pedir el arreglo dinámico new unsigned char[bytes]. </w:t>
+      </w:r>
+    </w:p>
+    <w:p>
+      <w:pPr>
+        <w:ind w:left="720"/>
+      </w:pPr>
+      <w:r>
+        <w:rPr>
+          <w:b/>
+          <w:bCs/>
+        </w:rPr>
+        <w:t>Inicializar con Fichas Aleatorias:</w:t>
+      </w:r>
+      <w:r>
+        <w:t xml:space="preserve"> Recorrer las coordenadas (fila, columna) con un doble ciclo </w:t>
+      </w:r>
+      <w:proofErr w:type="spellStart"/>
+      <w:r>
+        <w:t>for</w:t>
+      </w:r>
+      <w:proofErr w:type="spellEnd"/>
+      <w:r>
+        <w:t xml:space="preserve">, generar números aleatorios uniformes entre 0 y 5 (las 6 fichas de juego) y llamar a </w:t>
+      </w:r>
+      <w:proofErr w:type="spellStart"/>
+      <w:r>
+        <w:t>escribirFicha</w:t>
+      </w:r>
+      <w:proofErr w:type="spellEnd"/>
+      <w:r>
+        <w:t xml:space="preserve">. </w:t>
+      </w:r>
+    </w:p>
+    <w:p>
+      <w:pPr>
+        <w:ind w:left="720"/>
+      </w:pPr>
+      <w:r>
+        <w:rPr>
+          <w:b/>
+          <w:bCs/>
+        </w:rPr>
+        <w:t>El Renderizado (La Interfaz Visual):</w:t>
+      </w:r>
+      <w:r>
+        <w:t xml:space="preserve"> Crear una función </w:t>
+      </w:r>
+      <w:proofErr w:type="spellStart"/>
+      <w:r>
+        <w:t>mostrarTablero</w:t>
+      </w:r>
+      <w:proofErr w:type="spellEnd"/>
+      <w:r>
+        <w:t xml:space="preserve"> que recorra la matriz usando </w:t>
+      </w:r>
+      <w:proofErr w:type="spellStart"/>
+      <w:r>
+        <w:t>leerFicha</w:t>
+      </w:r>
+      <w:proofErr w:type="spellEnd"/>
+      <w:r>
+        <w:t xml:space="preserve"> y traduzca cada número a un símbolo amigable (ej. 0 -&gt; 'A', 1 -&gt; 'B', 6 -&gt; '.' para espacio libre). </w:t>
+      </w:r>
+    </w:p>
+    <w:p>
+      <w:pPr>
+        <w:ind w:left="720"/>
+      </w:pPr>
+      <w:r>
+        <w:rPr>
+          <w:b/>
+          <w:bCs/>
+        </w:rPr>
+        <w:t>La Destrucción Controlada:</w:t>
+      </w:r>
+      <w:r>
+        <w:t xml:space="preserve"> Garantizar la liberación de la memoria dinámicamente asignada mediante </w:t>
+      </w:r>
+      <w:proofErr w:type="spellStart"/>
+      <w:proofErr w:type="gramStart"/>
+      <w:r>
+        <w:t>delete</w:t>
+      </w:r>
+      <w:proofErr w:type="spellEnd"/>
+      <w:r>
+        <w:t>[</w:t>
+      </w:r>
+      <w:proofErr w:type="gramEnd"/>
+      <w:r>
+        <w:t>] al cerrar la partida.</w:t>
+      </w:r>
+    </w:p>
     <w:p/>
+    <w:p/>
+    <w:p/>
+    <w:p>
+      <w:r>
+        <w:t>Fase 2:</w:t>
+      </w:r>
+    </w:p>
+    <w:p>
+      <w:r>
+        <w:t>Crear modulo.</w:t>
+      </w:r>
+    </w:p>
+    <w:p/>
+    <w:p>
+      <w:r>
+        <w:rPr>
+          <w:b/>
+          <w:bCs/>
+          <w:sz w:val="28"/>
+          <w:szCs w:val="28"/>
+        </w:rPr>
+        <w:t>1.</w:t>
+      </w:r>
+      <w:r>
+        <w:rPr>
+          <w:b/>
+          <w:bCs/>
+          <w:sz w:val="28"/>
+          <w:szCs w:val="28"/>
+        </w:rPr>
+        <w:t xml:space="preserve">  </w:t>
+      </w:r>
+      <w:r>
+        <w:rPr>
+          <w:b/>
+          <w:bCs/>
+          <w:sz w:val="28"/>
+          <w:szCs w:val="28"/>
+        </w:rPr>
+        <w:t xml:space="preserve">Función para crear tablero = </w:t>
+      </w:r>
+      <w:proofErr w:type="spellStart"/>
+      <w:proofErr w:type="gramStart"/>
+      <w:r>
+        <w:rPr>
+          <w:b/>
+          <w:bCs/>
+          <w:sz w:val="28"/>
+          <w:szCs w:val="28"/>
+        </w:rPr>
+        <w:t>crearTablero</w:t>
+      </w:r>
+      <w:proofErr w:type="spellEnd"/>
+      <w:r>
+        <w:rPr>
+          <w:b/>
+          <w:bCs/>
+          <w:sz w:val="28"/>
+          <w:szCs w:val="28"/>
+        </w:rPr>
+        <w:t>(</w:t>
+      </w:r>
+      <w:proofErr w:type="gramEnd"/>
+      <w:r>
+        <w:rPr>
+          <w:b/>
+          <w:bCs/>
+          <w:sz w:val="28"/>
+          <w:szCs w:val="28"/>
+        </w:rPr>
+        <w:t>)</w:t>
+      </w:r>
+      <w:r>
+        <w:rPr>
+          <w:b/>
+          <w:bCs/>
+          <w:sz w:val="28"/>
+          <w:szCs w:val="28"/>
+        </w:rPr>
+        <w:t xml:space="preserve"> </w:t>
+      </w:r>
+    </w:p>
+    <w:p>
+      <w:pPr>
+        <w:ind w:left="708"/>
+      </w:pPr>
+      <w:r>
+        <w:lastRenderedPageBreak/>
+        <w:t>será</w:t>
+      </w:r>
+      <w:r>
+        <w:t xml:space="preserve"> el arquitecto del juego pide la memoria RAM exacta en el Heap e inicializa cada posición con una ficha aleatoria usando la API de bits que </w:t>
+      </w:r>
+      <w:r>
+        <w:t>se construyó</w:t>
+      </w:r>
+      <w:r>
+        <w:t xml:space="preserve"> en </w:t>
+      </w:r>
+      <w:proofErr w:type="gramStart"/>
+      <w:r>
+        <w:t xml:space="preserve">la </w:t>
+      </w:r>
+      <w:r>
+        <w:t xml:space="preserve"> fase</w:t>
+      </w:r>
+      <w:proofErr w:type="gramEnd"/>
+      <w:r>
+        <w:t xml:space="preserve"> </w:t>
+      </w:r>
+      <w:r>
+        <w:t>1</w:t>
+      </w:r>
+      <w:r>
+        <w:t>.</w:t>
+      </w:r>
+    </w:p>
+    <w:p>
+      <w:pPr>
+        <w:ind w:left="708"/>
+      </w:pPr>
+      <w:r>
+        <w:rPr>
+          <w:sz w:val="28"/>
+          <w:szCs w:val="28"/>
+        </w:rPr>
+        <w:t>Qué recibe:</w:t>
+      </w:r>
+      <w:r>
+        <w:t xml:space="preserve"> Dos enteros </w:t>
+      </w:r>
+      <w:proofErr w:type="spellStart"/>
+      <w:r>
+        <w:t>int</w:t>
+      </w:r>
+      <w:proofErr w:type="spellEnd"/>
+      <w:r>
+        <w:t xml:space="preserve"> filas, </w:t>
+      </w:r>
+      <w:proofErr w:type="spellStart"/>
+      <w:r>
+        <w:t>int</w:t>
+      </w:r>
+      <w:proofErr w:type="spellEnd"/>
+      <w:r>
+        <w:t xml:space="preserve"> columnas que definen el tamaño del tablero rectangular ingresado por el </w:t>
+      </w:r>
+      <w:r>
+        <w:t>jugador</w:t>
+      </w:r>
+    </w:p>
+    <w:p>
+      <w:pPr>
+        <w:ind w:left="708"/>
+      </w:pPr>
+      <w:r>
+        <w:rPr>
+          <w:sz w:val="28"/>
+          <w:szCs w:val="28"/>
+        </w:rPr>
+        <w:t>Qué retorna:</w:t>
+      </w:r>
+      <w:r>
+        <w:t xml:space="preserve"> Un puntero de tipo </w:t>
+      </w:r>
+      <w:proofErr w:type="spellStart"/>
+      <w:r>
+        <w:t>unsigned</w:t>
+      </w:r>
+      <w:proofErr w:type="spellEnd"/>
+      <w:r>
+        <w:t xml:space="preserve"> </w:t>
+      </w:r>
+      <w:proofErr w:type="spellStart"/>
+      <w:r>
+        <w:t>char</w:t>
+      </w:r>
+      <w:proofErr w:type="spellEnd"/>
+      <w:r>
+        <w:t>* con la dirección de memoria donde vive la tira de bytes en el Heap</w:t>
+      </w:r>
+    </w:p>
+    <w:p>
+      <w:pPr>
+        <w:ind w:left="708"/>
+      </w:pPr>
+      <w:r>
+        <w:rPr>
+          <w:sz w:val="28"/>
+          <w:szCs w:val="28"/>
+        </w:rPr>
+        <w:t>Para qué sirve:</w:t>
+      </w:r>
+      <w:r>
+        <w:t xml:space="preserve"> Para instanciar el tablero en memoria dinámica sin desperdiciar espacio, asegurando que solo se reserve la cantidad estricta de bytes necesarios para la partida</w:t>
+      </w:r>
+      <w:r>
+        <w:t>.</w:t>
+      </w:r>
+    </w:p>
+    <w:p>
+      <w:pPr>
+        <w:ind w:left="708"/>
+      </w:pPr>
+      <w:proofErr w:type="spellStart"/>
+      <w:proofErr w:type="gramStart"/>
+      <w:r>
+        <w:t>C</w:t>
+      </w:r>
+      <w:r>
+        <w:t>rearTablero</w:t>
+      </w:r>
+      <w:proofErr w:type="spellEnd"/>
+      <w:r>
+        <w:t>(</w:t>
+      </w:r>
+      <w:proofErr w:type="gramEnd"/>
+      <w:r>
+        <w:t>)</w:t>
+      </w:r>
+      <w:r>
+        <w:t xml:space="preserve"> conecta directamente la lógica de </w:t>
+      </w:r>
+      <w:r>
+        <w:t xml:space="preserve">esta fase (alto nivel) </w:t>
+      </w:r>
+      <w:r>
+        <w:t>con la Fase 1</w:t>
+      </w:r>
+      <w:r>
+        <w:t>, e</w:t>
+      </w:r>
+      <w:r>
+        <w:t xml:space="preserve">n lugar de manipular bits, esta función genera un número aleatorio entre 0 y 5 y llama a </w:t>
+      </w:r>
+      <w:proofErr w:type="spellStart"/>
+      <w:r>
+        <w:t>escribirFicha</w:t>
+      </w:r>
+      <w:proofErr w:type="spellEnd"/>
+      <w:r>
+        <w:t xml:space="preserve">. La Fase 1 se encarga por debajo de traducir ese valor y empaquetarlo en sus 3 bits correspondientes. El puntero devuelto por </w:t>
+      </w:r>
+      <w:proofErr w:type="spellStart"/>
+      <w:r>
+        <w:t>crearTablero</w:t>
+      </w:r>
+      <w:proofErr w:type="spellEnd"/>
+      <w:r>
+        <w:t xml:space="preserve"> será el que pases a todas las demás funciones del juego para mostrar pantalla, detectar combinaciones o borrar fichas</w:t>
+      </w:r>
+    </w:p>
+    <w:p>
+      <w:pPr>
+        <w:ind w:left="1416"/>
+      </w:pPr>
+      <w:r>
+        <w:rPr>
+          <w:sz w:val="28"/>
+          <w:szCs w:val="28"/>
+        </w:rPr>
+        <w:t>Cálculo de espacio:</w:t>
+      </w:r>
+      <w:r>
+        <w:t xml:space="preserve"> Multiplica </w:t>
+      </w:r>
+      <m:oMath>
+        <m:r>
+          <m:rPr>
+            <m:sty m:val="p"/>
+          </m:rPr>
+          <w:rPr>
+            <w:rFonts w:ascii="Cambria Math" w:hAnsi="Cambria Math"/>
+          </w:rPr>
+          <m:t>filas×columnas×3</m:t>
+        </m:r>
+      </m:oMath>
+      <w:r>
+        <w:t xml:space="preserve"> para saber el total de bits necesarios. </w:t>
+      </w:r>
+    </w:p>
+    <w:p>
+      <w:pPr>
+        <w:ind w:left="1416"/>
+      </w:pPr>
+      <w:r>
+        <w:rPr>
+          <w:sz w:val="28"/>
+          <w:szCs w:val="28"/>
+        </w:rPr>
+        <w:t>Conversión a bytes:</w:t>
+      </w:r>
+      <w:r>
+        <w:t xml:space="preserve"> Aplica la fórmula (</w:t>
+      </w:r>
+      <w:proofErr w:type="spellStart"/>
+      <w:r>
+        <w:t>total_bits</w:t>
+      </w:r>
+      <w:proofErr w:type="spellEnd"/>
+      <w:r>
+        <w:t xml:space="preserve"> + 7) / 8 para calcular los bytes mínimos indispensables. </w:t>
+      </w:r>
+    </w:p>
+    <w:p>
+      <w:pPr>
+        <w:ind w:left="1416"/>
+      </w:pPr>
+      <w:r>
+        <w:rPr>
+          <w:sz w:val="28"/>
+          <w:szCs w:val="28"/>
+        </w:rPr>
+        <w:t>Reserva en el Heap:</w:t>
+      </w:r>
+      <w:r>
+        <w:t xml:space="preserve"> Ejecuta </w:t>
+      </w:r>
+      <w:proofErr w:type="spellStart"/>
+      <w:r>
+        <w:t>unsigned</w:t>
+      </w:r>
+      <w:proofErr w:type="spellEnd"/>
+      <w:r>
+        <w:t xml:space="preserve"> </w:t>
+      </w:r>
+      <w:proofErr w:type="spellStart"/>
+      <w:r>
+        <w:t>char</w:t>
+      </w:r>
+      <w:proofErr w:type="spellEnd"/>
+      <w:r>
+        <w:t xml:space="preserve">* tablero = new </w:t>
+      </w:r>
+      <w:proofErr w:type="spellStart"/>
+      <w:r>
+        <w:t>unsigned</w:t>
+      </w:r>
+      <w:proofErr w:type="spellEnd"/>
+      <w:r>
+        <w:t xml:space="preserve"> </w:t>
+      </w:r>
+      <w:proofErr w:type="spellStart"/>
+      <w:r>
+        <w:t>char</w:t>
+      </w:r>
+      <w:proofErr w:type="spellEnd"/>
+      <w:r>
+        <w:t>[</w:t>
+      </w:r>
+      <w:proofErr w:type="spellStart"/>
+      <w:r>
+        <w:t>bytes_necesarios</w:t>
+      </w:r>
+      <w:proofErr w:type="spellEnd"/>
+      <w:r>
+        <w:t xml:space="preserve">]. </w:t>
+      </w:r>
+    </w:p>
+    <w:p>
+      <w:pPr>
+        <w:ind w:left="1416"/>
+      </w:pPr>
+      <w:r>
+        <w:rPr>
+          <w:sz w:val="28"/>
+          <w:szCs w:val="28"/>
+        </w:rPr>
+        <w:t>Limpieza de basura:</w:t>
+      </w:r>
+      <w:r>
+        <w:t xml:space="preserve"> Pone todos los bytes del arreglo en 0 para que los bits no contengan datos desconocidos de la RAM.</w:t>
+      </w:r>
+    </w:p>
+    <w:p>
+      <w:pPr>
+        <w:ind w:left="1416"/>
+      </w:pPr>
+      <w:r>
+        <w:rPr>
+          <w:sz w:val="28"/>
+          <w:szCs w:val="28"/>
+        </w:rPr>
+        <w:t>Doble ciclo explorador:</w:t>
+      </w:r>
+      <w:r>
+        <w:t xml:space="preserve"> Recorre la matriz celda por celda con un </w:t>
+      </w:r>
+      <w:proofErr w:type="spellStart"/>
+      <w:r>
+        <w:t>for</w:t>
+      </w:r>
+      <w:proofErr w:type="spellEnd"/>
+      <w:r>
+        <w:t xml:space="preserve"> de filas y un </w:t>
+      </w:r>
+      <w:proofErr w:type="spellStart"/>
+      <w:r>
+        <w:t>for</w:t>
+      </w:r>
+      <w:proofErr w:type="spellEnd"/>
+      <w:r>
+        <w:t xml:space="preserve"> de columnas.</w:t>
+      </w:r>
+    </w:p>
+    <w:p>
+      <w:pPr>
+        <w:ind w:left="1416"/>
+      </w:pPr>
+      <w:r>
+        <w:rPr>
+          <w:sz w:val="28"/>
+          <w:szCs w:val="28"/>
+        </w:rPr>
+        <w:t>Generación aleatoria:</w:t>
+      </w:r>
+      <w:r>
+        <w:t xml:space="preserve"> En cada celda (f, c), calcula una ficha aleatoria entre 0 y 5 usando </w:t>
+      </w:r>
+      <w:proofErr w:type="gramStart"/>
+      <w:r>
+        <w:t>rand(</w:t>
+      </w:r>
+      <w:proofErr w:type="gramEnd"/>
+      <w:r>
+        <w:t xml:space="preserve">) % 6. </w:t>
+      </w:r>
+    </w:p>
+    <w:p>
+      <w:pPr>
+        <w:ind w:left="1416"/>
+      </w:pPr>
+      <w:r>
+        <w:rPr>
+          <w:sz w:val="28"/>
+          <w:szCs w:val="28"/>
+        </w:rPr>
+        <w:t>Empaquetado:</w:t>
+      </w:r>
+      <w:r>
+        <w:t xml:space="preserve"> Ejecuta </w:t>
+      </w:r>
+      <w:proofErr w:type="spellStart"/>
+      <w:proofErr w:type="gramStart"/>
+      <w:r>
+        <w:t>escribirFicha</w:t>
+      </w:r>
+      <w:proofErr w:type="spellEnd"/>
+      <w:r>
+        <w:t>(</w:t>
+      </w:r>
+      <w:proofErr w:type="gramEnd"/>
+      <w:r>
+        <w:t xml:space="preserve">tablero, columnas, f, c, </w:t>
+      </w:r>
+      <w:proofErr w:type="spellStart"/>
+      <w:r>
+        <w:t>ficha_aleatoria</w:t>
+      </w:r>
+      <w:proofErr w:type="spellEnd"/>
+      <w:r>
+        <w:t xml:space="preserve">) en cada iteración. </w:t>
+      </w:r>
+    </w:p>
+    <w:p>
+      <w:pPr>
+        <w:ind w:left="1416"/>
+      </w:pPr>
+      <w:r>
+        <w:rPr>
+          <w:sz w:val="28"/>
+          <w:szCs w:val="28"/>
+        </w:rPr>
+        <w:lastRenderedPageBreak/>
+        <w:t>Retorno:</w:t>
+      </w:r>
+      <w:r>
+        <w:t xml:space="preserve"> Devuelve la variable tablero para que la función principal (</w:t>
+      </w:r>
+      <w:proofErr w:type="spellStart"/>
+      <w:r>
+        <w:t>main</w:t>
+      </w:r>
+      <w:proofErr w:type="spellEnd"/>
+      <w:r>
+        <w:t>) guarde la dirección de la memoria.</w:t>
+      </w:r>
+    </w:p>
     <w:p/>
     <w:p/>
     <w:sectPr>
@@ -478,6 +1641,559 @@
     </w:sectPr>
   </w:body>
 </w:document>
+</file>
+
+<file path=word/numbering.xml><?xml version="1.0" encoding="utf-8"?>
+<w:numbering xmlns:wpc="http://schemas.microsoft.com/office/word/2010/wordprocessingCanvas" xmlns:cx="http://schemas.microsoft.com/office/drawing/2014/chartex" xmlns:cx1="http://schemas.microsoft.com/office/drawing/2015/9/8/chartex" xmlns:cx2="http://schemas.microsoft.com/office/drawing/2015/10/21/chartex" xmlns:cx3="http://schemas.microsoft.com/office/drawing/2016/5/9/chartex" xmlns:cx4="http://schemas.microsoft.com/office/drawing/2016/5/10/chartex" xmlns:cx5="http://schemas.microsoft.com/office/drawing/2016/5/11/chartex" xmlns:cx6="http://schemas.microsoft.com/office/drawing/2016/5/12/chartex" xmlns:cx7="http://schemas.microsoft.com/office/drawing/2016/5/13/chartex" xmlns:cx8="http://schemas.microsoft.com/office/drawing/2016/5/14/chartex" xmlns:mc="http://schemas.openxmlformats.org/markup-compatibility/2006" xmlns:aink="http://schemas.microsoft.com/office/drawing/2016/ink" xmlns:am3d="http://schemas.microsoft.com/office/drawing/2017/model3d" xmlns:o="urn:schemas-microsoft-com:office:office" xmlns:oel="http://schemas.microsoft.com/office/2019/extlst" xmlns:r="http://schemas.openxmlformats.org/officeDocument/2006/relationships" xmlns:m="http://schemas.openxmlformats.org/officeDocument/2006/math" xmlns:v="urn:schemas-microsoft-com:vml" xmlns:wp14="http://schemas.microsoft.com/office/word/2010/wordprocessingDrawing" xmlns:wp="http://schemas.openxmlformats.org/drawingml/2006/wordprocessingDrawing" xmlns:w10="urn:schemas-microsoft-com:office:word" xmlns:w="http://schemas.openxmlformats.org/wordprocessingml/2006/main" xmlns:w14="http://schemas.microsoft.com/office/word/2010/wordml" xmlns:w15="http://schemas.microsoft.com/office/word/2012/wordml" xmlns:w16cex="http://schemas.microsoft.com/office/word/2018/wordml/cex" xmlns:w16cid="http://schemas.microsoft.com/office/word/2016/wordml/cid" xmlns:w16="http://schemas.microsoft.com/office/word/2018/wordml" xmlns:w16du="http://schemas.microsoft.com/office/word/2023/wordml/word16du" xmlns:w16sdtdh="http://schemas.microsoft.com/office/word/2020/wordml/sdtdatahash" xmlns:w16sdtfl="http://schemas.microsoft.com/office/word/2024/wordml/sdtformatlock" xmlns:w16se="http://schemas.microsoft.com/office/word/2015/wordml/symex" xmlns:wpg="http://schemas.microsoft.com/office/word/2010/wordprocessingGroup" xmlns:wpi="http://schemas.microsoft.com/office/word/2010/wordprocessingInk" xmlns:wne="http://schemas.microsoft.com/office/word/2006/wordml" xmlns:wps="http://schemas.microsoft.com/office/word/2010/wordprocessingShape" mc:Ignorable="w14 w15 w16se w16cid w16 w16cex w16sdtdh w16sdtfl w16du wp14">
+  <w:abstractNum w:abstractNumId="0" w15:restartNumberingAfterBreak="0">
+    <w:nsid w:val="255C6354"/>
+    <w:multiLevelType w:val="hybridMultilevel"/>
+    <w:tmpl w:val="C694BBC2"/>
+    <w:lvl w:ilvl="0" w:tplc="240A000F">
+      <w:start w:val="1"/>
+      <w:numFmt w:val="decimal"/>
+      <w:lvlText w:val="%1."/>
+      <w:lvlJc w:val="left"/>
+      <w:pPr>
+        <w:ind w:left="720" w:hanging="360"/>
+      </w:pPr>
+      <w:rPr>
+        <w:rFonts w:hint="default"/>
+      </w:rPr>
+    </w:lvl>
+    <w:lvl w:ilvl="1" w:tplc="240A0019" w:tentative="1">
+      <w:start w:val="1"/>
+      <w:numFmt w:val="lowerLetter"/>
+      <w:lvlText w:val="%2."/>
+      <w:lvlJc w:val="left"/>
+      <w:pPr>
+        <w:ind w:left="1440" w:hanging="360"/>
+      </w:pPr>
+    </w:lvl>
+    <w:lvl w:ilvl="2" w:tplc="240A001B" w:tentative="1">
+      <w:start w:val="1"/>
+      <w:numFmt w:val="lowerRoman"/>
+      <w:lvlText w:val="%3."/>
+      <w:lvlJc w:val="right"/>
+      <w:pPr>
+        <w:ind w:left="2160" w:hanging="180"/>
+      </w:pPr>
+    </w:lvl>
+    <w:lvl w:ilvl="3" w:tplc="240A000F" w:tentative="1">
+      <w:start w:val="1"/>
+      <w:numFmt w:val="decimal"/>
+      <w:lvlText w:val="%4."/>
+      <w:lvlJc w:val="left"/>
+      <w:pPr>
+        <w:ind w:left="2880" w:hanging="360"/>
+      </w:pPr>
+    </w:lvl>
+    <w:lvl w:ilvl="4" w:tplc="240A0019" w:tentative="1">
+      <w:start w:val="1"/>
+      <w:numFmt w:val="lowerLetter"/>
+      <w:lvlText w:val="%5."/>
+      <w:lvlJc w:val="left"/>
+      <w:pPr>
+        <w:ind w:left="3600" w:hanging="360"/>
+      </w:pPr>
+    </w:lvl>
+    <w:lvl w:ilvl="5" w:tplc="240A001B" w:tentative="1">
+      <w:start w:val="1"/>
+      <w:numFmt w:val="lowerRoman"/>
+      <w:lvlText w:val="%6."/>
+      <w:lvlJc w:val="right"/>
+      <w:pPr>
+        <w:ind w:left="4320" w:hanging="180"/>
+      </w:pPr>
+    </w:lvl>
+    <w:lvl w:ilvl="6" w:tplc="240A000F" w:tentative="1">
+      <w:start w:val="1"/>
+      <w:numFmt w:val="decimal"/>
+      <w:lvlText w:val="%7."/>
+      <w:lvlJc w:val="left"/>
+      <w:pPr>
+        <w:ind w:left="5040" w:hanging="360"/>
+      </w:pPr>
+    </w:lvl>
+    <w:lvl w:ilvl="7" w:tplc="240A0019" w:tentative="1">
+      <w:start w:val="1"/>
+      <w:numFmt w:val="lowerLetter"/>
+      <w:lvlText w:val="%8."/>
+      <w:lvlJc w:val="left"/>
+      <w:pPr>
+        <w:ind w:left="5760" w:hanging="360"/>
+      </w:pPr>
+    </w:lvl>
+    <w:lvl w:ilvl="8" w:tplc="240A001B" w:tentative="1">
+      <w:start w:val="1"/>
+      <w:numFmt w:val="lowerRoman"/>
+      <w:lvlText w:val="%9."/>
+      <w:lvlJc w:val="right"/>
+      <w:pPr>
+        <w:ind w:left="6480" w:hanging="180"/>
+      </w:pPr>
+    </w:lvl>
+  </w:abstractNum>
+  <w:abstractNum w:abstractNumId="1" w15:restartNumberingAfterBreak="0">
+    <w:nsid w:val="3843150B"/>
+    <w:multiLevelType w:val="multilevel"/>
+    <w:tmpl w:val="05F2796A"/>
+    <w:lvl w:ilvl="0">
+      <w:start w:val="1"/>
+      <w:numFmt w:val="bullet"/>
+      <w:lvlText w:val=""/>
+      <w:lvlJc w:val="left"/>
+      <w:pPr>
+        <w:tabs>
+          <w:tab w:val="num" w:pos="720"/>
+        </w:tabs>
+        <w:ind w:left="720" w:hanging="360"/>
+      </w:pPr>
+      <w:rPr>
+        <w:rFonts w:ascii="Symbol" w:hAnsi="Symbol" w:hint="default"/>
+        <w:sz w:val="20"/>
+      </w:rPr>
+    </w:lvl>
+    <w:lvl w:ilvl="1" w:tentative="1">
+      <w:start w:val="1"/>
+      <w:numFmt w:val="bullet"/>
+      <w:lvlText w:val="o"/>
+      <w:lvlJc w:val="left"/>
+      <w:pPr>
+        <w:tabs>
+          <w:tab w:val="num" w:pos="1440"/>
+        </w:tabs>
+        <w:ind w:left="1440" w:hanging="360"/>
+      </w:pPr>
+      <w:rPr>
+        <w:rFonts w:ascii="Courier New" w:hAnsi="Courier New" w:hint="default"/>
+        <w:sz w:val="20"/>
+      </w:rPr>
+    </w:lvl>
+    <w:lvl w:ilvl="2" w:tentative="1">
+      <w:start w:val="1"/>
+      <w:numFmt w:val="bullet"/>
+      <w:lvlText w:val=""/>
+      <w:lvlJc w:val="left"/>
+      <w:pPr>
+        <w:tabs>
+          <w:tab w:val="num" w:pos="2160"/>
+        </w:tabs>
+        <w:ind w:left="2160" w:hanging="360"/>
+      </w:pPr>
+      <w:rPr>
+        <w:rFonts w:ascii="Wingdings" w:hAnsi="Wingdings" w:hint="default"/>
+        <w:sz w:val="20"/>
+      </w:rPr>
+    </w:lvl>
+    <w:lvl w:ilvl="3" w:tentative="1">
+      <w:start w:val="1"/>
+      <w:numFmt w:val="bullet"/>
+      <w:lvlText w:val=""/>
+      <w:lvlJc w:val="left"/>
+      <w:pPr>
+        <w:tabs>
+          <w:tab w:val="num" w:pos="2880"/>
+        </w:tabs>
+        <w:ind w:left="2880" w:hanging="360"/>
+      </w:pPr>
+      <w:rPr>
+        <w:rFonts w:ascii="Wingdings" w:hAnsi="Wingdings" w:hint="default"/>
+        <w:sz w:val="20"/>
+      </w:rPr>
+    </w:lvl>
+    <w:lvl w:ilvl="4" w:tentative="1">
+      <w:start w:val="1"/>
+      <w:numFmt w:val="bullet"/>
+      <w:lvlText w:val=""/>
+      <w:lvlJc w:val="left"/>
+      <w:pPr>
+        <w:tabs>
+          <w:tab w:val="num" w:pos="3600"/>
+        </w:tabs>
+        <w:ind w:left="3600" w:hanging="360"/>
+      </w:pPr>
+      <w:rPr>
+        <w:rFonts w:ascii="Wingdings" w:hAnsi="Wingdings" w:hint="default"/>
+        <w:sz w:val="20"/>
+      </w:rPr>
+    </w:lvl>
+    <w:lvl w:ilvl="5" w:tentative="1">
+      <w:start w:val="1"/>
+      <w:numFmt w:val="bullet"/>
+      <w:lvlText w:val=""/>
+      <w:lvlJc w:val="left"/>
+      <w:pPr>
+        <w:tabs>
+          <w:tab w:val="num" w:pos="4320"/>
+        </w:tabs>
+        <w:ind w:left="4320" w:hanging="360"/>
+      </w:pPr>
+      <w:rPr>
+        <w:rFonts w:ascii="Wingdings" w:hAnsi="Wingdings" w:hint="default"/>
+        <w:sz w:val="20"/>
+      </w:rPr>
+    </w:lvl>
+    <w:lvl w:ilvl="6" w:tentative="1">
+      <w:start w:val="1"/>
+      <w:numFmt w:val="bullet"/>
+      <w:lvlText w:val=""/>
+      <w:lvlJc w:val="left"/>
+      <w:pPr>
+        <w:tabs>
+          <w:tab w:val="num" w:pos="5040"/>
+        </w:tabs>
+        <w:ind w:left="5040" w:hanging="360"/>
+      </w:pPr>
+      <w:rPr>
+        <w:rFonts w:ascii="Wingdings" w:hAnsi="Wingdings" w:hint="default"/>
+        <w:sz w:val="20"/>
+      </w:rPr>
+    </w:lvl>
+    <w:lvl w:ilvl="7" w:tentative="1">
+      <w:start w:val="1"/>
+      <w:numFmt w:val="bullet"/>
+      <w:lvlText w:val=""/>
+      <w:lvlJc w:val="left"/>
+      <w:pPr>
+        <w:tabs>
+          <w:tab w:val="num" w:pos="5760"/>
+        </w:tabs>
+        <w:ind w:left="5760" w:hanging="360"/>
+      </w:pPr>
+      <w:rPr>
+        <w:rFonts w:ascii="Wingdings" w:hAnsi="Wingdings" w:hint="default"/>
+        <w:sz w:val="20"/>
+      </w:rPr>
+    </w:lvl>
+    <w:lvl w:ilvl="8" w:tentative="1">
+      <w:start w:val="1"/>
+      <w:numFmt w:val="bullet"/>
+      <w:lvlText w:val=""/>
+      <w:lvlJc w:val="left"/>
+      <w:pPr>
+        <w:tabs>
+          <w:tab w:val="num" w:pos="6480"/>
+        </w:tabs>
+        <w:ind w:left="6480" w:hanging="360"/>
+      </w:pPr>
+      <w:rPr>
+        <w:rFonts w:ascii="Wingdings" w:hAnsi="Wingdings" w:hint="default"/>
+        <w:sz w:val="20"/>
+      </w:rPr>
+    </w:lvl>
+  </w:abstractNum>
+  <w:abstractNum w:abstractNumId="2" w15:restartNumberingAfterBreak="0">
+    <w:nsid w:val="4F123BF9"/>
+    <w:multiLevelType w:val="multilevel"/>
+    <w:tmpl w:val="0F8A86D8"/>
+    <w:lvl w:ilvl="0">
+      <w:start w:val="1"/>
+      <w:numFmt w:val="bullet"/>
+      <w:lvlText w:val=""/>
+      <w:lvlJc w:val="left"/>
+      <w:pPr>
+        <w:tabs>
+          <w:tab w:val="num" w:pos="720"/>
+        </w:tabs>
+        <w:ind w:left="720" w:hanging="360"/>
+      </w:pPr>
+      <w:rPr>
+        <w:rFonts w:ascii="Symbol" w:hAnsi="Symbol" w:hint="default"/>
+        <w:sz w:val="20"/>
+      </w:rPr>
+    </w:lvl>
+    <w:lvl w:ilvl="1" w:tentative="1">
+      <w:start w:val="1"/>
+      <w:numFmt w:val="bullet"/>
+      <w:lvlText w:val="o"/>
+      <w:lvlJc w:val="left"/>
+      <w:pPr>
+        <w:tabs>
+          <w:tab w:val="num" w:pos="1440"/>
+        </w:tabs>
+        <w:ind w:left="1440" w:hanging="360"/>
+      </w:pPr>
+      <w:rPr>
+        <w:rFonts w:ascii="Courier New" w:hAnsi="Courier New" w:hint="default"/>
+        <w:sz w:val="20"/>
+      </w:rPr>
+    </w:lvl>
+    <w:lvl w:ilvl="2" w:tentative="1">
+      <w:start w:val="1"/>
+      <w:numFmt w:val="bullet"/>
+      <w:lvlText w:val=""/>
+      <w:lvlJc w:val="left"/>
+      <w:pPr>
+        <w:tabs>
+          <w:tab w:val="num" w:pos="2160"/>
+        </w:tabs>
+        <w:ind w:left="2160" w:hanging="360"/>
+      </w:pPr>
+      <w:rPr>
+        <w:rFonts w:ascii="Wingdings" w:hAnsi="Wingdings" w:hint="default"/>
+        <w:sz w:val="20"/>
+      </w:rPr>
+    </w:lvl>
+    <w:lvl w:ilvl="3" w:tentative="1">
+      <w:start w:val="1"/>
+      <w:numFmt w:val="bullet"/>
+      <w:lvlText w:val=""/>
+      <w:lvlJc w:val="left"/>
+      <w:pPr>
+        <w:tabs>
+          <w:tab w:val="num" w:pos="2880"/>
+        </w:tabs>
+        <w:ind w:left="2880" w:hanging="360"/>
+      </w:pPr>
+      <w:rPr>
+        <w:rFonts w:ascii="Wingdings" w:hAnsi="Wingdings" w:hint="default"/>
+        <w:sz w:val="20"/>
+      </w:rPr>
+    </w:lvl>
+    <w:lvl w:ilvl="4" w:tentative="1">
+      <w:start w:val="1"/>
+      <w:numFmt w:val="bullet"/>
+      <w:lvlText w:val=""/>
+      <w:lvlJc w:val="left"/>
+      <w:pPr>
+        <w:tabs>
+          <w:tab w:val="num" w:pos="3600"/>
+        </w:tabs>
+        <w:ind w:left="3600" w:hanging="360"/>
+      </w:pPr>
+      <w:rPr>
+        <w:rFonts w:ascii="Wingdings" w:hAnsi="Wingdings" w:hint="default"/>
+        <w:sz w:val="20"/>
+      </w:rPr>
+    </w:lvl>
+    <w:lvl w:ilvl="5" w:tentative="1">
+      <w:start w:val="1"/>
+      <w:numFmt w:val="bullet"/>
+      <w:lvlText w:val=""/>
+      <w:lvlJc w:val="left"/>
+      <w:pPr>
+        <w:tabs>
+          <w:tab w:val="num" w:pos="4320"/>
+        </w:tabs>
+        <w:ind w:left="4320" w:hanging="360"/>
+      </w:pPr>
+      <w:rPr>
+        <w:rFonts w:ascii="Wingdings" w:hAnsi="Wingdings" w:hint="default"/>
+        <w:sz w:val="20"/>
+      </w:rPr>
+    </w:lvl>
+    <w:lvl w:ilvl="6" w:tentative="1">
+      <w:start w:val="1"/>
+      <w:numFmt w:val="bullet"/>
+      <w:lvlText w:val=""/>
+      <w:lvlJc w:val="left"/>
+      <w:pPr>
+        <w:tabs>
+          <w:tab w:val="num" w:pos="5040"/>
+        </w:tabs>
+        <w:ind w:left="5040" w:hanging="360"/>
+      </w:pPr>
+      <w:rPr>
+        <w:rFonts w:ascii="Wingdings" w:hAnsi="Wingdings" w:hint="default"/>
+        <w:sz w:val="20"/>
+      </w:rPr>
+    </w:lvl>
+    <w:lvl w:ilvl="7" w:tentative="1">
+      <w:start w:val="1"/>
+      <w:numFmt w:val="bullet"/>
+      <w:lvlText w:val=""/>
+      <w:lvlJc w:val="left"/>
+      <w:pPr>
+        <w:tabs>
+          <w:tab w:val="num" w:pos="5760"/>
+        </w:tabs>
+        <w:ind w:left="5760" w:hanging="360"/>
+      </w:pPr>
+      <w:rPr>
+        <w:rFonts w:ascii="Wingdings" w:hAnsi="Wingdings" w:hint="default"/>
+        <w:sz w:val="20"/>
+      </w:rPr>
+    </w:lvl>
+    <w:lvl w:ilvl="8" w:tentative="1">
+      <w:start w:val="1"/>
+      <w:numFmt w:val="bullet"/>
+      <w:lvlText w:val=""/>
+      <w:lvlJc w:val="left"/>
+      <w:pPr>
+        <w:tabs>
+          <w:tab w:val="num" w:pos="6480"/>
+        </w:tabs>
+        <w:ind w:left="6480" w:hanging="360"/>
+      </w:pPr>
+      <w:rPr>
+        <w:rFonts w:ascii="Wingdings" w:hAnsi="Wingdings" w:hint="default"/>
+        <w:sz w:val="20"/>
+      </w:rPr>
+    </w:lvl>
+  </w:abstractNum>
+  <w:abstractNum w:abstractNumId="3" w15:restartNumberingAfterBreak="0">
+    <w:nsid w:val="663D7153"/>
+    <w:multiLevelType w:val="multilevel"/>
+    <w:tmpl w:val="B9489B72"/>
+    <w:lvl w:ilvl="0">
+      <w:start w:val="1"/>
+      <w:numFmt w:val="bullet"/>
+      <w:lvlText w:val=""/>
+      <w:lvlJc w:val="left"/>
+      <w:pPr>
+        <w:tabs>
+          <w:tab w:val="num" w:pos="720"/>
+        </w:tabs>
+        <w:ind w:left="720" w:hanging="360"/>
+      </w:pPr>
+      <w:rPr>
+        <w:rFonts w:ascii="Symbol" w:hAnsi="Symbol" w:hint="default"/>
+        <w:sz w:val="20"/>
+      </w:rPr>
+    </w:lvl>
+    <w:lvl w:ilvl="1" w:tentative="1">
+      <w:start w:val="1"/>
+      <w:numFmt w:val="bullet"/>
+      <w:lvlText w:val="o"/>
+      <w:lvlJc w:val="left"/>
+      <w:pPr>
+        <w:tabs>
+          <w:tab w:val="num" w:pos="1440"/>
+        </w:tabs>
+        <w:ind w:left="1440" w:hanging="360"/>
+      </w:pPr>
+      <w:rPr>
+        <w:rFonts w:ascii="Courier New" w:hAnsi="Courier New" w:hint="default"/>
+        <w:sz w:val="20"/>
+      </w:rPr>
+    </w:lvl>
+    <w:lvl w:ilvl="2" w:tentative="1">
+      <w:start w:val="1"/>
+      <w:numFmt w:val="bullet"/>
+      <w:lvlText w:val=""/>
+      <w:lvlJc w:val="left"/>
+      <w:pPr>
+        <w:tabs>
+          <w:tab w:val="num" w:pos="2160"/>
+        </w:tabs>
+        <w:ind w:left="2160" w:hanging="360"/>
+      </w:pPr>
+      <w:rPr>
+        <w:rFonts w:ascii="Wingdings" w:hAnsi="Wingdings" w:hint="default"/>
+        <w:sz w:val="20"/>
+      </w:rPr>
+    </w:lvl>
+    <w:lvl w:ilvl="3" w:tentative="1">
+      <w:start w:val="1"/>
+      <w:numFmt w:val="bullet"/>
+      <w:lvlText w:val=""/>
+      <w:lvlJc w:val="left"/>
+      <w:pPr>
+        <w:tabs>
+          <w:tab w:val="num" w:pos="2880"/>
+        </w:tabs>
+        <w:ind w:left="2880" w:hanging="360"/>
+      </w:pPr>
+      <w:rPr>
+        <w:rFonts w:ascii="Wingdings" w:hAnsi="Wingdings" w:hint="default"/>
+        <w:sz w:val="20"/>
+      </w:rPr>
+    </w:lvl>
+    <w:lvl w:ilvl="4" w:tentative="1">
+      <w:start w:val="1"/>
+      <w:numFmt w:val="bullet"/>
+      <w:lvlText w:val=""/>
+      <w:lvlJc w:val="left"/>
+      <w:pPr>
+        <w:tabs>
+          <w:tab w:val="num" w:pos="3600"/>
+        </w:tabs>
+        <w:ind w:left="3600" w:hanging="360"/>
+      </w:pPr>
+      <w:rPr>
+        <w:rFonts w:ascii="Wingdings" w:hAnsi="Wingdings" w:hint="default"/>
+        <w:sz w:val="20"/>
+      </w:rPr>
+    </w:lvl>
+    <w:lvl w:ilvl="5" w:tentative="1">
+      <w:start w:val="1"/>
+      <w:numFmt w:val="bullet"/>
+      <w:lvlText w:val=""/>
+      <w:lvlJc w:val="left"/>
+      <w:pPr>
+        <w:tabs>
+          <w:tab w:val="num" w:pos="4320"/>
+        </w:tabs>
+        <w:ind w:left="4320" w:hanging="360"/>
+      </w:pPr>
+      <w:rPr>
+        <w:rFonts w:ascii="Wingdings" w:hAnsi="Wingdings" w:hint="default"/>
+        <w:sz w:val="20"/>
+      </w:rPr>
+    </w:lvl>
+    <w:lvl w:ilvl="6" w:tentative="1">
+      <w:start w:val="1"/>
+      <w:numFmt w:val="bullet"/>
+      <w:lvlText w:val=""/>
+      <w:lvlJc w:val="left"/>
+      <w:pPr>
+        <w:tabs>
+          <w:tab w:val="num" w:pos="5040"/>
+        </w:tabs>
+        <w:ind w:left="5040" w:hanging="360"/>
+      </w:pPr>
+      <w:rPr>
+        <w:rFonts w:ascii="Wingdings" w:hAnsi="Wingdings" w:hint="default"/>
+        <w:sz w:val="20"/>
+      </w:rPr>
+    </w:lvl>
+    <w:lvl w:ilvl="7" w:tentative="1">
+      <w:start w:val="1"/>
+      <w:numFmt w:val="bullet"/>
+      <w:lvlText w:val=""/>
+      <w:lvlJc w:val="left"/>
+      <w:pPr>
+        <w:tabs>
+          <w:tab w:val="num" w:pos="5760"/>
+        </w:tabs>
+        <w:ind w:left="5760" w:hanging="360"/>
+      </w:pPr>
+      <w:rPr>
+        <w:rFonts w:ascii="Wingdings" w:hAnsi="Wingdings" w:hint="default"/>
+        <w:sz w:val="20"/>
+      </w:rPr>
+    </w:lvl>
+    <w:lvl w:ilvl="8" w:tentative="1">
+      <w:start w:val="1"/>
+      <w:numFmt w:val="bullet"/>
+      <w:lvlText w:val=""/>
+      <w:lvlJc w:val="left"/>
+      <w:pPr>
+        <w:tabs>
+          <w:tab w:val="num" w:pos="6480"/>
+        </w:tabs>
+        <w:ind w:left="6480" w:hanging="360"/>
+      </w:pPr>
+      <w:rPr>
+        <w:rFonts w:ascii="Wingdings" w:hAnsi="Wingdings" w:hint="default"/>
+        <w:sz w:val="20"/>
+      </w:rPr>
+    </w:lvl>
+  </w:abstractNum>
+  <w:num w:numId="1" w16cid:durableId="1699240406">
+    <w:abstractNumId w:val="3"/>
+  </w:num>
+  <w:num w:numId="2" w16cid:durableId="535391248">
+    <w:abstractNumId w:val="1"/>
+  </w:num>
+  <w:num w:numId="3" w16cid:durableId="1320420967">
+    <w:abstractNumId w:val="2"/>
+  </w:num>
+  <w:num w:numId="4" w16cid:durableId="2134474122">
+    <w:abstractNumId w:val="0"/>
+  </w:num>
+</w:numbering>
 </file>
 
 <file path=word/styles.xml><?xml version="1.0" encoding="utf-8"?>
@@ -1396,6 +3112,17 @@
       <w:spacing w:val="5"/>
     </w:rPr>
   </w:style>
+  <w:style w:type="paragraph" w:styleId="NormalWeb">
+    <w:name w:val="Normal (Web)"/>
+    <w:basedOn w:val="Normal"/>
+    <w:uiPriority w:val="99"/>
+    <w:semiHidden/>
+    <w:unhideWhenUsed/>
+    <w:rsid w:val="00D15004"/>
+    <w:rPr>
+      <w:rFonts w:ascii="Times New Roman" w:hAnsi="Times New Roman" w:cs="Times New Roman"/>
+    </w:rPr>
+  </w:style>
 </w:styles>
 </file>
 

</xml_diff>